<commit_message>
fix(desktop): align DMG background 1:1 with window dimensions (660x440)
</commit_message>
<xml_diff>
--- a/docs/使用说明.docx
+++ b/docs/使用说明.docx
@@ -611,8 +611,6 @@
         </w:rPr>
         <w:t>3. 登录系统</w:t>
       </w:r>
-      <w:bookmarkStart w:id="0" w:name="_GoBack"/>
-      <w:bookmarkEnd w:id="0"/>
     </w:p>
     <w:p>
       <w:pPr>
@@ -998,6 +996,178 @@
         <w:t>3.  在浏览器窗口中正常登录、办理业务即可。</w:t>
       </w:r>
     </w:p>
+    <w:p>
+      <w:pPr>
+        <w:spacing w:before="80" w:after="80"/>
+      </w:pPr>
+      <w:r>
+        <w:rPr>
+          <w:rFonts w:ascii="微软雅黑" w:hAnsi="微软雅黑" w:eastAsia="微软雅黑"/>
+          <w:b/>
+          <w:sz w:val="22"/>
+        </w:rPr>
+        <w:t>操作界面如下图所示：</w:t>
+      </w:r>
+    </w:p>
+    <w:p>
+      <w:pPr>
+        <w:spacing w:before="160" w:after="40"/>
+        <w:jc w:val="center"/>
+      </w:pPr>
+      <w:r>
+        <w:drawing>
+          <wp:inline distT="0" distB="0" distL="114300" distR="114300">
+            <wp:extent cx="5477510" cy="3740785"/>
+            <wp:effectExtent l="0" t="0" r="8890" b="18415"/>
+            <wp:docPr id="1" name="图片 1"/>
+            <wp:cNvGraphicFramePr>
+              <a:graphicFrameLocks xmlns:a="http://schemas.openxmlformats.org/drawingml/2006/main" noChangeAspect="1"/>
+            </wp:cNvGraphicFramePr>
+            <a:graphic xmlns:a="http://schemas.openxmlformats.org/drawingml/2006/main">
+              <a:graphicData uri="http://schemas.openxmlformats.org/drawingml/2006/picture">
+                <pic:pic xmlns:pic="http://schemas.openxmlformats.org/drawingml/2006/picture">
+                  <pic:nvPicPr>
+                    <pic:cNvPr id="1" name="图片 1"/>
+                    <pic:cNvPicPr>
+                      <a:picLocks noChangeAspect="1"/>
+                    </pic:cNvPicPr>
+                  </pic:nvPicPr>
+                  <pic:blipFill>
+                    <a:blip r:embed="rId7"/>
+                    <a:stretch>
+                      <a:fillRect/>
+                    </a:stretch>
+                  </pic:blipFill>
+                  <pic:spPr>
+                    <a:xfrm>
+                      <a:off x="0" y="0"/>
+                      <a:ext cx="5477510" cy="3740785"/>
+                    </a:xfrm>
+                    <a:prstGeom prst="rect">
+                      <a:avLst/>
+                    </a:prstGeom>
+                    <a:noFill/>
+                    <a:ln>
+                      <a:noFill/>
+                    </a:ln>
+                  </pic:spPr>
+                </pic:pic>
+              </a:graphicData>
+            </a:graphic>
+          </wp:inline>
+        </w:drawing>
+      </w:r>
+    </w:p>
+    <w:p>
+      <w:pPr>
+        <w:spacing w:before="60" w:after="240"/>
+        <w:jc w:val="center"/>
+      </w:pPr>
+      <w:r>
+        <w:rPr>
+          <w:rFonts w:ascii="微软雅黑" w:hAnsi="微软雅黑" w:eastAsia="微软雅黑"/>
+          <w:b/>
+          <w:color w:val="445577"/>
+          <w:sz w:val="18"/>
+        </w:rPr>
+        <w:t>图1  「平台管理」页 — 点击管理员分配的平台入口（如「巨量方舟」）</w:t>
+      </w:r>
+    </w:p>
+    <w:p>
+      <w:pPr>
+        <w:spacing w:before="120" w:after="80"/>
+      </w:pPr>
+      <w:r>
+        <w:rPr>
+          <w:rFonts w:ascii="微软雅黑" w:hAnsi="微软雅黑" w:eastAsia="微软雅黑"/>
+          <w:b w:val="0"/>
+          <w:sz w:val="22"/>
+        </w:rPr>
+        <w:t>点击平台卡片右侧的「打开平台」</w:t>
+      </w:r>
+      <w:r>
+        <w:rPr>
+          <w:rFonts w:ascii="微软雅黑" w:hAnsi="微软雅黑" w:eastAsia="微软雅黑"/>
+          <w:b/>
+          <w:color w:val="1F6FC4"/>
+          <w:sz w:val="22"/>
+        </w:rPr>
+        <w:t xml:space="preserve">  →  </w:t>
+      </w:r>
+      <w:r>
+        <w:rPr>
+          <w:rFonts w:ascii="微软雅黑" w:hAnsi="微软雅黑" w:eastAsia="微软雅黑"/>
+          <w:b w:val="0"/>
+          <w:sz w:val="22"/>
+        </w:rPr>
+        <w:t>客户端自动开启全新独立浏览器窗口并跳转至对应平台：</w:t>
+      </w:r>
+    </w:p>
+    <w:p>
+      <w:pPr>
+        <w:spacing w:before="160" w:after="40"/>
+        <w:jc w:val="center"/>
+      </w:pPr>
+      <w:r>
+        <w:drawing>
+          <wp:inline distT="0" distB="0" distL="114300" distR="114300">
+            <wp:extent cx="5476240" cy="3128010"/>
+            <wp:effectExtent l="0" t="0" r="10160" b="21590"/>
+            <wp:docPr id="3" name="图片 2"/>
+            <wp:cNvGraphicFramePr>
+              <a:graphicFrameLocks xmlns:a="http://schemas.openxmlformats.org/drawingml/2006/main" noChangeAspect="1"/>
+            </wp:cNvGraphicFramePr>
+            <a:graphic xmlns:a="http://schemas.openxmlformats.org/drawingml/2006/main">
+              <a:graphicData uri="http://schemas.openxmlformats.org/drawingml/2006/picture">
+                <pic:pic xmlns:pic="http://schemas.openxmlformats.org/drawingml/2006/picture">
+                  <pic:nvPicPr>
+                    <pic:cNvPr id="3" name="图片 2"/>
+                    <pic:cNvPicPr>
+                      <a:picLocks noChangeAspect="1"/>
+                    </pic:cNvPicPr>
+                  </pic:nvPicPr>
+                  <pic:blipFill>
+                    <a:blip r:embed="rId8"/>
+                    <a:stretch>
+                      <a:fillRect/>
+                    </a:stretch>
+                  </pic:blipFill>
+                  <pic:spPr>
+                    <a:xfrm>
+                      <a:off x="0" y="0"/>
+                      <a:ext cx="5476240" cy="3128010"/>
+                    </a:xfrm>
+                    <a:prstGeom prst="rect">
+                      <a:avLst/>
+                    </a:prstGeom>
+                    <a:noFill/>
+                    <a:ln>
+                      <a:noFill/>
+                    </a:ln>
+                  </pic:spPr>
+                </pic:pic>
+              </a:graphicData>
+            </a:graphic>
+          </wp:inline>
+        </w:drawing>
+      </w:r>
+    </w:p>
+    <w:p>
+      <w:pPr>
+        <w:spacing w:before="60" w:after="240"/>
+        <w:jc w:val="center"/>
+      </w:pPr>
+      <w:r>
+        <w:rPr>
+          <w:rFonts w:ascii="微软雅黑" w:hAnsi="微软雅黑" w:eastAsia="微软雅黑"/>
+          <w:b/>
+          <w:color w:val="445577"/>
+          <w:sz w:val="18"/>
+        </w:rPr>
+        <w:t>图2  独立浏览器窗口自动打开，进入「巨量引擎方舟」平台页面</w:t>
+      </w:r>
+    </w:p>
+    <w:p/>
     <w:p>
       <w:pPr>
         <w:spacing w:after="80"/>
@@ -1503,6 +1673,73 @@
         <w:t xml:space="preserve"> 当管理员为您调整了平台权限、代理或直连域名后，客户端可能需要点击「重新同步配置」按钮来获取最新设置。若管理员更新了配置，客户端也会自动提示您重新同步。</w:t>
       </w:r>
     </w:p>
+    <w:p>
+      <w:pPr>
+        <w:spacing w:before="160" w:after="40"/>
+        <w:jc w:val="center"/>
+      </w:pPr>
+      <w:r>
+        <w:drawing>
+          <wp:inline distT="0" distB="0" distL="114300" distR="114300">
+            <wp:extent cx="5477510" cy="3740785"/>
+            <wp:effectExtent l="0" t="0" r="8890" b="18415"/>
+            <wp:docPr id="4" name="图片 3"/>
+            <wp:cNvGraphicFramePr>
+              <a:graphicFrameLocks xmlns:a="http://schemas.openxmlformats.org/drawingml/2006/main" noChangeAspect="1"/>
+            </wp:cNvGraphicFramePr>
+            <a:graphic xmlns:a="http://schemas.openxmlformats.org/drawingml/2006/main">
+              <a:graphicData uri="http://schemas.openxmlformats.org/drawingml/2006/picture">
+                <pic:pic xmlns:pic="http://schemas.openxmlformats.org/drawingml/2006/picture">
+                  <pic:nvPicPr>
+                    <pic:cNvPr id="4" name="图片 3"/>
+                    <pic:cNvPicPr>
+                      <a:picLocks noChangeAspect="1"/>
+                    </pic:cNvPicPr>
+                  </pic:nvPicPr>
+                  <pic:blipFill>
+                    <a:blip r:embed="rId9"/>
+                    <a:stretch>
+                      <a:fillRect/>
+                    </a:stretch>
+                  </pic:blipFill>
+                  <pic:spPr>
+                    <a:xfrm>
+                      <a:off x="0" y="0"/>
+                      <a:ext cx="5477510" cy="3740785"/>
+                    </a:xfrm>
+                    <a:prstGeom prst="rect">
+                      <a:avLst/>
+                    </a:prstGeom>
+                    <a:noFill/>
+                    <a:ln>
+                      <a:noFill/>
+                    </a:ln>
+                  </pic:spPr>
+                </pic:pic>
+              </a:graphicData>
+            </a:graphic>
+          </wp:inline>
+        </w:drawing>
+      </w:r>
+      <w:bookmarkStart w:id="0" w:name="_GoBack"/>
+      <w:bookmarkEnd w:id="0"/>
+    </w:p>
+    <w:p>
+      <w:pPr>
+        <w:spacing w:before="60" w:after="240"/>
+        <w:jc w:val="center"/>
+      </w:pPr>
+      <w:r>
+        <w:rPr>
+          <w:rFonts w:ascii="微软雅黑" w:hAnsi="微软雅黑" w:eastAsia="微软雅黑"/>
+          <w:b/>
+          <w:color w:val="445577"/>
+          <w:sz w:val="18"/>
+        </w:rPr>
+        <w:t>图3  「系统配置 → 全局代理环境」：网络模式、代理节点 IP 与连接状态</w:t>
+      </w:r>
+    </w:p>
+    <w:p/>
     <w:p>
       <w:pPr>
         <w:spacing w:before="160" w:after="120"/>

</xml_diff>